<commit_message>
added function library push_relevant_context
</commit_message>
<xml_diff>
--- a/Setup and tips/venv.docx
+++ b/Setup and tips/venv.docx
@@ -19,470 +19,101 @@
           <w:sz w:val="72"/>
           <w:szCs w:val="72"/>
         </w:rPr>
-        <w:t>Ollama</w:t>
+        <w:t>venv</w:t>
       </w:r>
     </w:p>
     <w:p>
       <w:r>
-        <w:t xml:space="preserve">Download from </w:t>
+        <w:t xml:space="preserve">We’ll use </w:t>
       </w:r>
-      <w:hyperlink r:id="rId5" w:history="1">
-        <w:r>
-          <w:rPr>
-            <w:rStyle w:val="Hyperlink"/>
-          </w:rPr>
-          <w:t>https://ollama.com/</w:t>
-        </w:r>
-      </w:hyperlink>
-    </w:p>
-    <w:p>
+      <w:proofErr w:type="spellStart"/>
       <w:r>
-        <w:t xml:space="preserve">Ollama is </w:t>
+        <w:t>uv</w:t>
       </w:r>
+      <w:proofErr w:type="spellEnd"/>
       <w:r>
-        <w:rPr>
-          <w:b/>
-          <w:bCs/>
-        </w:rPr>
-        <w:t>not the model</w:t>
-      </w:r>
-      <w:r>
-        <w:t xml:space="preserve">. It's the software that </w:t>
-      </w:r>
-      <w:r>
-        <w:rPr>
-          <w:b/>
-          <w:bCs/>
-        </w:rPr>
-        <w:t>manages and runs</w:t>
-      </w:r>
-      <w:r>
-        <w:t xml:space="preserve"> the models on your computer.</w:t>
+        <w:t xml:space="preserve"> as a virtual environment system.</w:t>
       </w:r>
     </w:p>
     <w:p>
       <w:r>
-        <w:t>Think of it like this:</w:t>
+        <w:t xml:space="preserve">Open a </w:t>
+      </w:r>
+      <w:proofErr w:type="spellStart"/>
+      <w:r>
+        <w:t>cmd</w:t>
+      </w:r>
+      <w:proofErr w:type="spellEnd"/>
+    </w:p>
+    <w:p>
+      <w:pPr>
+        <w:pStyle w:val="Lijstalinea"/>
+        <w:numPr>
+          <w:ilvl w:val="0"/>
+          <w:numId w:val="4"/>
+        </w:numPr>
+      </w:pPr>
+      <w:proofErr w:type="spellStart"/>
+      <w:r>
+        <w:t>uv</w:t>
+      </w:r>
+      <w:proofErr w:type="spellEnd"/>
+      <w:r>
+        <w:t xml:space="preserve"> init</w:t>
       </w:r>
     </w:p>
     <w:p>
       <w:pPr>
+        <w:pStyle w:val="Lijstalinea"/>
         <w:numPr>
           <w:ilvl w:val="0"/>
-          <w:numId w:val="1"/>
+          <w:numId w:val="4"/>
         </w:numPr>
       </w:pPr>
+      <w:proofErr w:type="spellStart"/>
       <w:r>
-        <w:rPr>
-          <w:b/>
-          <w:bCs/>
-        </w:rPr>
-        <w:t>Ollama</w:t>
+        <w:t>uv</w:t>
       </w:r>
+      <w:proofErr w:type="spellEnd"/>
       <w:r>
-        <w:t xml:space="preserve"> = the engine (or runtime) </w:t>
+        <w:t xml:space="preserve"> venv</w:t>
       </w:r>
     </w:p>
     <w:p>
       <w:pPr>
+        <w:pStyle w:val="Lijstalinea"/>
         <w:numPr>
           <w:ilvl w:val="0"/>
-          <w:numId w:val="1"/>
+          <w:numId w:val="4"/>
         </w:numPr>
       </w:pPr>
+      <w:proofErr w:type="spellStart"/>
       <w:r>
-        <w:rPr>
-          <w:b/>
-          <w:bCs/>
-        </w:rPr>
-        <w:t>Llama 3.2, Phi-3, Gemma 3</w:t>
+        <w:t>uv</w:t>
       </w:r>
+      <w:proofErr w:type="spellEnd"/>
       <w:r>
-        <w:t xml:space="preserve"> = the engines' "programs" or models </w:t>
+        <w:t xml:space="preserve"> add -r requirements.txt</w:t>
       </w:r>
     </w:p>
     <w:p>
-      <w:r>
-        <w:t>So your installation looks something like this:</w:t>
-      </w:r>
-    </w:p>
-    <w:p>
-      <w:r>
-        <w:t>Your application</w:t>
-      </w:r>
-    </w:p>
-    <w:p>
-      <w:r>
-        <w:t xml:space="preserve">        │</w:t>
-      </w:r>
-    </w:p>
-    <w:p>
-      <w:r>
-        <w:t xml:space="preserve">        </w:t>
-      </w:r>
-      <w:r>
-        <w:rPr>
-          <w:rFonts w:ascii="Arial" w:hAnsi="Arial" w:cs="Arial"/>
-        </w:rPr>
-        <w:t>▼</w:t>
-      </w:r>
-    </w:p>
-    <w:p>
-      <w:r>
-        <w:t xml:space="preserve">     Ollama</w:t>
-      </w:r>
-    </w:p>
-    <w:p>
-      <w:r>
-        <w:t xml:space="preserve">        │</w:t>
-      </w:r>
-    </w:p>
-    <w:p>
-      <w:r>
-        <w:t xml:space="preserve">        </w:t>
-      </w:r>
-      <w:r>
-        <w:rPr>
-          <w:rFonts w:ascii="MS Gothic" w:eastAsia="MS Gothic" w:hAnsi="MS Gothic" w:cs="MS Gothic" w:hint="eastAsia"/>
-        </w:rPr>
-        <w:t>├</w:t>
-      </w:r>
-      <w:r>
-        <w:rPr>
-          <w:rFonts w:ascii="Aptos" w:hAnsi="Aptos" w:cs="Aptos"/>
-        </w:rPr>
-        <w:t>──</w:t>
-      </w:r>
-      <w:r>
-        <w:t xml:space="preserve"> llama3.2:latest (2.0 GB)</w:t>
-      </w:r>
-    </w:p>
-    <w:p>
-      <w:r>
-        <w:t xml:space="preserve">        </w:t>
-      </w:r>
-      <w:r>
-        <w:rPr>
-          <w:rFonts w:ascii="MS Gothic" w:eastAsia="MS Gothic" w:hAnsi="MS Gothic" w:cs="MS Gothic" w:hint="eastAsia"/>
-        </w:rPr>
-        <w:t>├</w:t>
-      </w:r>
-      <w:r>
-        <w:rPr>
-          <w:rFonts w:ascii="Aptos" w:hAnsi="Aptos" w:cs="Aptos"/>
-        </w:rPr>
-        <w:t>──</w:t>
-      </w:r>
-      <w:r>
-        <w:t xml:space="preserve"> phi3:latest     (2.2 GB)</w:t>
-      </w:r>
-    </w:p>
-    <w:p>
-      <w:r>
-        <w:t xml:space="preserve">        └── gemma3:270m     (291 MB)</w:t>
-      </w:r>
-    </w:p>
-    <w:p>
-      <w:pPr>
-        <w:rPr>
-          <w:b/>
-          <w:bCs/>
-        </w:rPr>
-      </w:pPr>
-      <w:r>
-        <w:rPr>
-          <w:b/>
-          <w:bCs/>
-        </w:rPr>
-        <w:t>What Ollama does</w:t>
-      </w:r>
-    </w:p>
-    <w:p>
-      <w:r>
-        <w:t>Ollama is responsible for:</w:t>
-      </w:r>
-    </w:p>
-    <w:p>
-      <w:pPr>
+      <w:pPr>
+        <w:pStyle w:val="Lijstalinea"/>
         <w:numPr>
           <w:ilvl w:val="0"/>
-          <w:numId w:val="2"/>
+          <w:numId w:val="4"/>
         </w:numPr>
       </w:pPr>
-      <w:r>
-        <w:t>Downloading models (</w:t>
-      </w:r>
       <w:proofErr w:type="spellStart"/>
       <w:r>
-        <w:t>ollama</w:t>
+        <w:t>uv</w:t>
       </w:r>
       <w:proofErr w:type="spellEnd"/>
       <w:r>
-        <w:t xml:space="preserve"> pull) </w:t>
+        <w:t xml:space="preserve"> sync</w:t>
       </w:r>
     </w:p>
-    <w:p>
-      <w:pPr>
-        <w:numPr>
-          <w:ilvl w:val="0"/>
-          <w:numId w:val="2"/>
-        </w:numPr>
-      </w:pPr>
-      <w:r>
-        <w:t xml:space="preserve">Storing them on disk </w:t>
-      </w:r>
-    </w:p>
-    <w:p>
-      <w:pPr>
-        <w:numPr>
-          <w:ilvl w:val="0"/>
-          <w:numId w:val="2"/>
-        </w:numPr>
-      </w:pPr>
-      <w:r>
-        <w:t xml:space="preserve">Loading them into RAM when needed </w:t>
-      </w:r>
-    </w:p>
-    <w:p>
-      <w:pPr>
-        <w:numPr>
-          <w:ilvl w:val="0"/>
-          <w:numId w:val="2"/>
-        </w:numPr>
-      </w:pPr>
-      <w:r>
-        <w:t xml:space="preserve">Running inference (generating responses) </w:t>
-      </w:r>
-    </w:p>
-    <w:p>
-      <w:pPr>
-        <w:numPr>
-          <w:ilvl w:val="0"/>
-          <w:numId w:val="2"/>
-        </w:numPr>
-      </w:pPr>
-      <w:r>
-        <w:t xml:space="preserve">Exposing an API on http://localhost:11434 </w:t>
-      </w:r>
-    </w:p>
-    <w:p>
-      <w:pPr>
-        <w:numPr>
-          <w:ilvl w:val="0"/>
-          <w:numId w:val="2"/>
-        </w:numPr>
-      </w:pPr>
-      <w:r>
-        <w:t xml:space="preserve">Unloading models when they're no longer in use </w:t>
-      </w:r>
-    </w:p>
-    <w:p>
-      <w:r>
-        <w:t>The models themselves are just data files (weights). They cannot do anything by themselves.</w:t>
-      </w:r>
-    </w:p>
-    <w:p>
-      <w:pPr>
-        <w:rPr>
-          <w:b/>
-          <w:bCs/>
-        </w:rPr>
-      </w:pPr>
-      <w:r>
-        <w:rPr>
-          <w:b/>
-          <w:bCs/>
-        </w:rPr>
-        <w:t>For example</w:t>
-      </w:r>
-    </w:p>
-    <w:p>
-      <w:r>
-        <w:lastRenderedPageBreak/>
-        <w:t>When you run:</w:t>
-      </w:r>
-    </w:p>
-    <w:p>
-      <w:proofErr w:type="spellStart"/>
-      <w:r>
-        <w:t>ollama</w:t>
-      </w:r>
-      <w:proofErr w:type="spellEnd"/>
-      <w:r>
-        <w:t xml:space="preserve"> run llama3.2</w:t>
-      </w:r>
-    </w:p>
-    <w:p>
-      <w:r>
-        <w:t>Ollama:</w:t>
-      </w:r>
-    </w:p>
-    <w:p>
-      <w:pPr>
-        <w:numPr>
-          <w:ilvl w:val="0"/>
-          <w:numId w:val="3"/>
-        </w:numPr>
-      </w:pPr>
-      <w:r>
-        <w:t xml:space="preserve">Finds the llama3.2 files on disk. </w:t>
-      </w:r>
-    </w:p>
-    <w:p>
-      <w:pPr>
-        <w:numPr>
-          <w:ilvl w:val="0"/>
-          <w:numId w:val="3"/>
-        </w:numPr>
-      </w:pPr>
-      <w:r>
-        <w:t xml:space="preserve">Loads them into memory. </w:t>
-      </w:r>
-    </w:p>
-    <w:p>
-      <w:pPr>
-        <w:numPr>
-          <w:ilvl w:val="0"/>
-          <w:numId w:val="3"/>
-        </w:numPr>
-      </w:pPr>
-      <w:r>
-        <w:t xml:space="preserve">Starts generating text. </w:t>
-      </w:r>
-    </w:p>
-    <w:p>
-      <w:pPr>
-        <w:numPr>
-          <w:ilvl w:val="0"/>
-          <w:numId w:val="3"/>
-        </w:numPr>
-      </w:pPr>
-      <w:r>
-        <w:t xml:space="preserve">Shows you a chat prompt. </w:t>
-      </w:r>
-    </w:p>
-    <w:p>
-      <w:r>
-        <w:t>Similarly:</w:t>
-      </w:r>
-    </w:p>
-    <w:p>
-      <w:proofErr w:type="spellStart"/>
-      <w:r>
-        <w:t>ollama</w:t>
-      </w:r>
-      <w:proofErr w:type="spellEnd"/>
-      <w:r>
-        <w:t xml:space="preserve"> run phi3</w:t>
-      </w:r>
-    </w:p>
-    <w:p>
-      <w:r>
-        <w:t>uses the exact same Ollama program, but loads a different model.</w:t>
-      </w:r>
-    </w:p>
-    <w:p>
-      <w:pPr>
-        <w:rPr>
-          <w:b/>
-          <w:bCs/>
-        </w:rPr>
-      </w:pPr>
-      <w:r>
-        <w:rPr>
-          <w:b/>
-          <w:bCs/>
-        </w:rPr>
-        <w:t>Where are the models?</w:t>
-      </w:r>
-    </w:p>
-    <w:p>
-      <w:r>
-        <w:t>On Windows, they're typically stored under:</w:t>
-      </w:r>
-    </w:p>
-    <w:p>
-      <w:r>
-        <w:t>C:\Users\&lt;your username&gt;\.</w:t>
-      </w:r>
-      <w:proofErr w:type="spellStart"/>
-      <w:r>
-        <w:t>ollama</w:t>
-      </w:r>
-      <w:proofErr w:type="spellEnd"/>
-      <w:r>
-        <w:t>\models</w:t>
-      </w:r>
-    </w:p>
-    <w:p>
-      <w:r>
-        <w:t>(or in a system-managed location, depending on how Ollama was installed).</w:t>
-      </w:r>
-    </w:p>
-    <w:p>
-      <w:pPr>
-        <w:rPr>
-          <w:b/>
-          <w:bCs/>
-        </w:rPr>
-      </w:pPr>
-      <w:r>
-        <w:rPr>
-          <w:b/>
-          <w:bCs/>
-        </w:rPr>
-        <w:t>Why do other programs need Ollama?</w:t>
-      </w:r>
-    </w:p>
-    <w:p>
-      <w:r>
-        <w:t xml:space="preserve">Many applications (e.g. Open </w:t>
-      </w:r>
-      <w:proofErr w:type="spellStart"/>
-      <w:r>
-        <w:t>WebUI</w:t>
-      </w:r>
-      <w:proofErr w:type="spellEnd"/>
-      <w:r>
-        <w:t xml:space="preserve">, Continue, VS Code extensions, </w:t>
-      </w:r>
-      <w:proofErr w:type="spellStart"/>
-      <w:r>
-        <w:t>AnythingLLM</w:t>
-      </w:r>
-      <w:proofErr w:type="spellEnd"/>
-      <w:r>
-        <w:t>) don't run the models directly. Instead, they send requests like:</w:t>
-      </w:r>
-    </w:p>
-    <w:p>
-      <w:r>
-        <w:t>"Generate text using llama3.2"</w:t>
-      </w:r>
-    </w:p>
-    <w:p>
-      <w:r>
-        <w:t xml:space="preserve">to </w:t>
-      </w:r>
-      <w:proofErr w:type="spellStart"/>
-      <w:r>
-        <w:t>Ollama's</w:t>
-      </w:r>
-      <w:proofErr w:type="spellEnd"/>
-      <w:r>
-        <w:t xml:space="preserve"> local API:</w:t>
-      </w:r>
-    </w:p>
-    <w:p>
-      <w:r>
-        <w:t>http://localhost:11434</w:t>
-      </w:r>
-    </w:p>
-    <w:p>
-      <w:r>
-        <w:t>Ollama does the heavy lifting and returns the generated text.</w:t>
-      </w:r>
-    </w:p>
+    <w:p/>
     <w:p/>
     <w:sectPr>
       <w:pgSz w:w="11906" w:h="16838"/>
@@ -795,6 +426,118 @@
     </w:lvl>
   </w:abstractNum>
   <w:abstractNum w:abstractNumId="2" w15:restartNumberingAfterBreak="0">
+    <w:nsid w:val="4FD03453"/>
+    <w:multiLevelType w:val="hybridMultilevel"/>
+    <w:tmpl w:val="2BCECD2A"/>
+    <w:lvl w:ilvl="0" w:tplc="1FF0946A">
+      <w:numFmt w:val="bullet"/>
+      <w:lvlText w:val=""/>
+      <w:lvlJc w:val="left"/>
+      <w:pPr>
+        <w:ind w:left="720" w:hanging="360"/>
+      </w:pPr>
+      <w:rPr>
+        <w:rFonts w:ascii="Symbol" w:eastAsiaTheme="minorHAnsi" w:hAnsi="Symbol" w:cstheme="minorBidi" w:hint="default"/>
+      </w:rPr>
+    </w:lvl>
+    <w:lvl w:ilvl="1" w:tplc="08090003" w:tentative="1">
+      <w:start w:val="1"/>
+      <w:numFmt w:val="bullet"/>
+      <w:lvlText w:val="o"/>
+      <w:lvlJc w:val="left"/>
+      <w:pPr>
+        <w:ind w:left="1440" w:hanging="360"/>
+      </w:pPr>
+      <w:rPr>
+        <w:rFonts w:ascii="Courier New" w:hAnsi="Courier New" w:cs="Courier New" w:hint="default"/>
+      </w:rPr>
+    </w:lvl>
+    <w:lvl w:ilvl="2" w:tplc="08090005" w:tentative="1">
+      <w:start w:val="1"/>
+      <w:numFmt w:val="bullet"/>
+      <w:lvlText w:val=""/>
+      <w:lvlJc w:val="left"/>
+      <w:pPr>
+        <w:ind w:left="2160" w:hanging="360"/>
+      </w:pPr>
+      <w:rPr>
+        <w:rFonts w:ascii="Wingdings" w:hAnsi="Wingdings" w:hint="default"/>
+      </w:rPr>
+    </w:lvl>
+    <w:lvl w:ilvl="3" w:tplc="08090001" w:tentative="1">
+      <w:start w:val="1"/>
+      <w:numFmt w:val="bullet"/>
+      <w:lvlText w:val=""/>
+      <w:lvlJc w:val="left"/>
+      <w:pPr>
+        <w:ind w:left="2880" w:hanging="360"/>
+      </w:pPr>
+      <w:rPr>
+        <w:rFonts w:ascii="Symbol" w:hAnsi="Symbol" w:hint="default"/>
+      </w:rPr>
+    </w:lvl>
+    <w:lvl w:ilvl="4" w:tplc="08090003" w:tentative="1">
+      <w:start w:val="1"/>
+      <w:numFmt w:val="bullet"/>
+      <w:lvlText w:val="o"/>
+      <w:lvlJc w:val="left"/>
+      <w:pPr>
+        <w:ind w:left="3600" w:hanging="360"/>
+      </w:pPr>
+      <w:rPr>
+        <w:rFonts w:ascii="Courier New" w:hAnsi="Courier New" w:cs="Courier New" w:hint="default"/>
+      </w:rPr>
+    </w:lvl>
+    <w:lvl w:ilvl="5" w:tplc="08090005" w:tentative="1">
+      <w:start w:val="1"/>
+      <w:numFmt w:val="bullet"/>
+      <w:lvlText w:val=""/>
+      <w:lvlJc w:val="left"/>
+      <w:pPr>
+        <w:ind w:left="4320" w:hanging="360"/>
+      </w:pPr>
+      <w:rPr>
+        <w:rFonts w:ascii="Wingdings" w:hAnsi="Wingdings" w:hint="default"/>
+      </w:rPr>
+    </w:lvl>
+    <w:lvl w:ilvl="6" w:tplc="08090001" w:tentative="1">
+      <w:start w:val="1"/>
+      <w:numFmt w:val="bullet"/>
+      <w:lvlText w:val=""/>
+      <w:lvlJc w:val="left"/>
+      <w:pPr>
+        <w:ind w:left="5040" w:hanging="360"/>
+      </w:pPr>
+      <w:rPr>
+        <w:rFonts w:ascii="Symbol" w:hAnsi="Symbol" w:hint="default"/>
+      </w:rPr>
+    </w:lvl>
+    <w:lvl w:ilvl="7" w:tplc="08090003" w:tentative="1">
+      <w:start w:val="1"/>
+      <w:numFmt w:val="bullet"/>
+      <w:lvlText w:val="o"/>
+      <w:lvlJc w:val="left"/>
+      <w:pPr>
+        <w:ind w:left="5760" w:hanging="360"/>
+      </w:pPr>
+      <w:rPr>
+        <w:rFonts w:ascii="Courier New" w:hAnsi="Courier New" w:cs="Courier New" w:hint="default"/>
+      </w:rPr>
+    </w:lvl>
+    <w:lvl w:ilvl="8" w:tplc="08090005" w:tentative="1">
+      <w:start w:val="1"/>
+      <w:numFmt w:val="bullet"/>
+      <w:lvlText w:val=""/>
+      <w:lvlJc w:val="left"/>
+      <w:pPr>
+        <w:ind w:left="6480" w:hanging="360"/>
+      </w:pPr>
+      <w:rPr>
+        <w:rFonts w:ascii="Wingdings" w:hAnsi="Wingdings" w:hint="default"/>
+      </w:rPr>
+    </w:lvl>
+  </w:abstractNum>
+  <w:abstractNum w:abstractNumId="3" w15:restartNumberingAfterBreak="0">
     <w:nsid w:val="53ED6AE7"/>
     <w:multiLevelType w:val="multilevel"/>
     <w:tmpl w:val="BEB0028E"/>
@@ -914,6 +657,9 @@
     <w:abstractNumId w:val="1"/>
   </w:num>
   <w:num w:numId="3" w16cid:durableId="926155357">
+    <w:abstractNumId w:val="3"/>
+  </w:num>
+  <w:num w:numId="4" w16cid:durableId="786855780">
     <w:abstractNumId w:val="2"/>
   </w:num>
 </w:numbering>
@@ -1522,6 +1268,7 @@
   <w:style w:type="character" w:default="1" w:styleId="Standaardalinea-lettertype">
     <w:name w:val="Default Paragraph Font"/>
     <w:uiPriority w:val="1"/>
+    <w:semiHidden/>
     <w:unhideWhenUsed/>
   </w:style>
   <w:style w:type="table" w:default="1" w:styleId="Standaardtabel">

</xml_diff>